<commit_message>
Thêm các file báo cáo
</commit_message>
<xml_diff>
--- a/word.docx
+++ b/word.docx
@@ -1359,7 +1359,35 @@
           <w:sz w:val="26"/>
           <w:szCs w:val="26"/>
         </w:rPr>
-        <w:t>Để hoàn thành đề tài và đạt được những kết quả trong luận văn này, em xin bày tỏ lòng biết ơn sâu sắc đến Thầy Phạm Nguyên Hoàng. Em chân thành cảm ơn thầy đã luôn theo sát, đặt ra những câu hỏi gợi mở và định hướng rõ ràng giúp em nhìn nhận bao quát quy trình thực hiện đề tài. Những kiến thức và góp ý quý báu mà thầy chia sẻ trong từng buổi báo cáo tiến độ đã giúp em giải quyết những bế tắc về mặt kỹ thuật và hoàn thiện bài báo cáo một cách tốt nhất. Em thật sự trân trọng và biết ơn sự tận tâm hướng dẫn của thầy.</w:t>
+        <w:t>Để hoàn thành đề tài và đạt được những kết quả trong luận văn này, em xin bày tỏ lòng biết ơn sâu sắc đến Thầy Phạm Nguyên Hoàng. Em chân thành cảm ơn thầy đã luôn theo sát, đặt ra những câu hỏi gợi mở</w:t>
+      </w:r>
+      <w:r>
+        <w:rPr>
+          <w:sz w:val="26"/>
+          <w:szCs w:val="26"/>
+        </w:rPr>
+        <w:t xml:space="preserve"> ý tưởng</w:t>
+      </w:r>
+      <w:r>
+        <w:rPr>
+          <w:sz w:val="26"/>
+          <w:szCs w:val="26"/>
+        </w:rPr>
+        <w:t xml:space="preserve"> và định hướng rõ ràng giúp em nhìn nhận bao quát quy trình</w:t>
+      </w:r>
+      <w:r>
+        <w:rPr>
+          <w:sz w:val="26"/>
+          <w:szCs w:val="26"/>
+        </w:rPr>
+        <w:t xml:space="preserve"> và kiến thức để</w:t>
+      </w:r>
+      <w:r>
+        <w:rPr>
+          <w:sz w:val="26"/>
+          <w:szCs w:val="26"/>
+        </w:rPr>
+        <w:t xml:space="preserve"> thực hiện đề tài. Những kiến thức và góp ý quý báu mà thầy chia sẻ trong từng buổi báo cáo tiến độ đã giúp em giải quyết những bế tắc về mặt kỹ thuật và hoàn thiện bài báo cáo một cách tốt nhất. Em thật sự trân trọng và biết ơn sự tận tâm hướng dẫn của thầy.</w:t>
       </w:r>
     </w:p>
     <w:p>
@@ -1384,7 +1412,161 @@
           <w:sz w:val="26"/>
           <w:szCs w:val="26"/>
         </w:rPr>
-        <w:t>Em cũng xin gửi lời cám ơn chân thành đến các Thầy Cô Giảng viên Trường Đại học Cần Thơ, đặc biệt là các Thầy Cô tại Khoa Công nghệ Thông tin &amp; Truyền thông, những người đã truyền đạt cho em những nền tảng kiến thức vô giá trong suốt những năm học vừa qua.</w:t>
+        <w:t xml:space="preserve">Em cũng xin gửi lời cám ơn chân thành đến các </w:t>
+      </w:r>
+      <w:r>
+        <w:rPr>
+          <w:sz w:val="26"/>
+          <w:szCs w:val="26"/>
+        </w:rPr>
+        <w:t>t</w:t>
+      </w:r>
+      <w:r>
+        <w:rPr>
+          <w:sz w:val="26"/>
+          <w:szCs w:val="26"/>
+        </w:rPr>
+        <w:t xml:space="preserve">hầy </w:t>
+      </w:r>
+      <w:r>
+        <w:rPr>
+          <w:sz w:val="26"/>
+          <w:szCs w:val="26"/>
+        </w:rPr>
+        <w:t>c</w:t>
+      </w:r>
+      <w:r>
+        <w:rPr>
+          <w:sz w:val="26"/>
+          <w:szCs w:val="26"/>
+        </w:rPr>
+        <w:t xml:space="preserve">ô </w:t>
+      </w:r>
+      <w:r>
+        <w:rPr>
+          <w:sz w:val="26"/>
+          <w:szCs w:val="26"/>
+        </w:rPr>
+        <w:t>g</w:t>
+      </w:r>
+      <w:r>
+        <w:rPr>
+          <w:sz w:val="26"/>
+          <w:szCs w:val="26"/>
+        </w:rPr>
+        <w:t xml:space="preserve">iảng viên  Đại </w:t>
+      </w:r>
+      <w:r>
+        <w:rPr>
+          <w:sz w:val="26"/>
+          <w:szCs w:val="26"/>
+        </w:rPr>
+        <w:t>H</w:t>
+      </w:r>
+      <w:r>
+        <w:rPr>
+          <w:sz w:val="26"/>
+          <w:szCs w:val="26"/>
+        </w:rPr>
+        <w:t xml:space="preserve">ọc Cần Thơ, đặc biệt là các </w:t>
+      </w:r>
+      <w:r>
+        <w:rPr>
+          <w:sz w:val="26"/>
+          <w:szCs w:val="26"/>
+        </w:rPr>
+        <w:t>t</w:t>
+      </w:r>
+      <w:r>
+        <w:rPr>
+          <w:sz w:val="26"/>
+          <w:szCs w:val="26"/>
+        </w:rPr>
+        <w:t xml:space="preserve">hầy </w:t>
+      </w:r>
+      <w:r>
+        <w:rPr>
+          <w:sz w:val="26"/>
+          <w:szCs w:val="26"/>
+        </w:rPr>
+        <w:t>c</w:t>
+      </w:r>
+      <w:r>
+        <w:rPr>
+          <w:sz w:val="26"/>
+          <w:szCs w:val="26"/>
+        </w:rPr>
+        <w:t xml:space="preserve">ô tại </w:t>
+      </w:r>
+      <w:r>
+        <w:rPr>
+          <w:sz w:val="26"/>
+          <w:szCs w:val="26"/>
+        </w:rPr>
+        <w:t>Trường</w:t>
+      </w:r>
+      <w:r>
+        <w:rPr>
+          <w:sz w:val="26"/>
+          <w:szCs w:val="26"/>
+        </w:rPr>
+        <w:t xml:space="preserve"> Công </w:t>
+      </w:r>
+      <w:r>
+        <w:rPr>
+          <w:sz w:val="26"/>
+          <w:szCs w:val="26"/>
+        </w:rPr>
+        <w:t>Ng</w:t>
+      </w:r>
+      <w:r>
+        <w:rPr>
+          <w:sz w:val="26"/>
+          <w:szCs w:val="26"/>
+        </w:rPr>
+        <w:t xml:space="preserve">hệ Thông </w:t>
+      </w:r>
+      <w:r>
+        <w:rPr>
+          <w:sz w:val="26"/>
+          <w:szCs w:val="26"/>
+        </w:rPr>
+        <w:t>T</w:t>
+      </w:r>
+      <w:r>
+        <w:rPr>
+          <w:sz w:val="26"/>
+          <w:szCs w:val="26"/>
+        </w:rPr>
+        <w:t xml:space="preserve">in </w:t>
+      </w:r>
+      <w:r>
+        <w:rPr>
+          <w:sz w:val="26"/>
+          <w:szCs w:val="26"/>
+        </w:rPr>
+        <w:t>Và</w:t>
+      </w:r>
+      <w:r>
+        <w:rPr>
+          <w:sz w:val="26"/>
+          <w:szCs w:val="26"/>
+        </w:rPr>
+        <w:t xml:space="preserve"> Truyền </w:t>
+      </w:r>
+      <w:r>
+        <w:rPr>
+          <w:sz w:val="26"/>
+          <w:szCs w:val="26"/>
+        </w:rPr>
+        <w:t>T</w:t>
+      </w:r>
+      <w:r>
+        <w:rPr>
+          <w:sz w:val="26"/>
+          <w:szCs w:val="26"/>
+        </w:rPr>
+        <w:t>hông, những người đã truyền đạt cho em những nền tảng kiến thức vô giá trong suốt những năm học vừa qua.</w:t>
       </w:r>
     </w:p>
     <w:p>
@@ -1434,8 +1616,115 @@
           <w:sz w:val="26"/>
           <w:szCs w:val="26"/>
         </w:rPr>
-        <w:t>Tuy đã có nhiều cố gắng trong quá trình thực hiện, nhưng do giới hạn về mặt thời gian và kinh nghiệm thực tiễn, hệ thống và bài báo cáo chắc chắn không thể tránh khỏi những thiếu sót. Em rất mong nhận được sự đóng góp ý kiến quý báu của Thầy Cô và các bạn để đề tài được hoàn thiện hơn trong tương lai.</w:t>
-      </w:r>
+        <w:t>Tuy đã có nhiều cố gắng trong quá trình thực hiện</w:t>
+      </w:r>
+      <w:r>
+        <w:rPr>
+          <w:sz w:val="26"/>
+          <w:szCs w:val="26"/>
+        </w:rPr>
+        <w:t xml:space="preserve"> đề tài</w:t>
+      </w:r>
+      <w:r>
+        <w:rPr>
+          <w:sz w:val="26"/>
+          <w:szCs w:val="26"/>
+        </w:rPr>
+        <w:t xml:space="preserve">, nhưng do giới hạn về mặt thời </w:t>
+      </w:r>
+      <w:r>
+        <w:rPr>
+          <w:sz w:val="26"/>
+          <w:szCs w:val="26"/>
+        </w:rPr>
+        <w:t>gian,</w:t>
+      </w:r>
+      <w:r>
+        <w:rPr>
+          <w:sz w:val="26"/>
+          <w:szCs w:val="26"/>
+        </w:rPr>
+        <w:t xml:space="preserve"> kinh nghiệm thực tiễn</w:t>
+      </w:r>
+      <w:r>
+        <w:rPr>
+          <w:sz w:val="26"/>
+          <w:szCs w:val="26"/>
+        </w:rPr>
+        <w:t xml:space="preserve"> và kiến thức chuyên sâu</w:t>
+      </w:r>
+      <w:r>
+        <w:rPr>
+          <w:sz w:val="26"/>
+          <w:szCs w:val="26"/>
+        </w:rPr>
+        <w:t xml:space="preserve">, hệ thống </w:t>
+      </w:r>
+      <w:r>
+        <w:rPr>
+          <w:sz w:val="26"/>
+          <w:szCs w:val="26"/>
+        </w:rPr>
+        <w:t xml:space="preserve">em xây dựng được </w:t>
+      </w:r>
+      <w:r>
+        <w:rPr>
+          <w:sz w:val="26"/>
+          <w:szCs w:val="26"/>
+        </w:rPr>
+        <w:t xml:space="preserve">và bài báo cáo </w:t>
+      </w:r>
+      <w:r>
+        <w:rPr>
+          <w:sz w:val="26"/>
+          <w:szCs w:val="26"/>
+        </w:rPr>
+        <w:t xml:space="preserve">luận văn tốt nghiệp này </w:t>
+      </w:r>
+      <w:r>
+        <w:rPr>
+          <w:sz w:val="26"/>
+          <w:szCs w:val="26"/>
+        </w:rPr>
+        <w:t xml:space="preserve">chắc chắn không thể tránh khỏi những thiếu sót. Em rất mong nhận được sự đóng góp ý quý báu của </w:t>
+      </w:r>
+      <w:r>
+        <w:rPr>
+          <w:sz w:val="26"/>
+          <w:szCs w:val="26"/>
+        </w:rPr>
+        <w:t>t</w:t>
+      </w:r>
+      <w:r>
+        <w:rPr>
+          <w:sz w:val="26"/>
+          <w:szCs w:val="26"/>
+        </w:rPr>
+        <w:t xml:space="preserve">hầy </w:t>
+      </w:r>
+      <w:r>
+        <w:rPr>
+          <w:sz w:val="26"/>
+          <w:szCs w:val="26"/>
+        </w:rPr>
+        <w:t>c</w:t>
+      </w:r>
+      <w:r>
+        <w:rPr>
+          <w:sz w:val="26"/>
+          <w:szCs w:val="26"/>
+        </w:rPr>
+        <w:t>ô và các bạn để đề tài được hoàn thiện hơn trong tương lai.</w:t>
+      </w:r>
+    </w:p>
+    <w:p>
+      <w:pPr>
+        <w:ind w:firstLine="720"/>
+        <w:rPr>
+          <w:sz w:val="26"/>
+          <w:szCs w:val="26"/>
+        </w:rPr>
+      </w:pPr>
     </w:p>
     <w:p>
       <w:pPr>
@@ -8143,23 +8432,7 @@
               <w:sz w:val="26"/>
               <w:szCs w:val="26"/>
             </w:rPr>
-            <m:t>= y</m:t>
-          </m:r>
-          <m:r>
-            <w:rPr>
-              <w:rFonts w:ascii="Cambria Math" w:hAnsi="Cambria Math"/>
-              <w:sz w:val="26"/>
-              <w:szCs w:val="26"/>
-            </w:rPr>
-            <m:t xml:space="preserve"> </m:t>
-          </m:r>
-          <m:r>
-            <w:rPr>
-              <w:rFonts w:ascii="Cambria Math" w:hAnsi="Cambria Math"/>
-              <w:sz w:val="26"/>
-              <w:szCs w:val="26"/>
-            </w:rPr>
-            <m:t>⋅σ</m:t>
+            <m:t>= y ⋅σ</m:t>
           </m:r>
           <m:d>
             <m:dPr>
@@ -8954,16 +9227,7 @@
               <w:szCs w:val="26"/>
               <w:lang w:val="en-US"/>
             </w:rPr>
-            <m:t>+αv</m:t>
-          </m:r>
-          <m:r>
-            <w:rPr>
-              <w:rFonts w:ascii="Cambria Math" w:hAnsi="Cambria Math"/>
-              <w:sz w:val="26"/>
-              <w:szCs w:val="26"/>
-              <w:lang w:val="en-US"/>
-            </w:rPr>
-            <m:t xml:space="preserve">  </m:t>
+            <m:t xml:space="preserve">+αv  </m:t>
           </m:r>
         </m:oMath>
       </m:oMathPara>
@@ -9988,39 +10252,7 @@
           <w:szCs w:val="26"/>
         </w:rPr>
         <w:lastRenderedPageBreak/>
-        <w:t>Thay vì dựa vào các cạnh vật lý của tấm biển (thường bị che khuất</w:t>
-      </w:r>
-      <w:r>
-        <w:rPr>
-          <w:rFonts w:ascii="Times New Roman" w:hAnsi="Times New Roman" w:cs="Times New Roman"/>
-          <w:sz w:val="26"/>
-          <w:szCs w:val="26"/>
-        </w:rPr>
-        <w:t xml:space="preserve"> bởi các biển hiệu khác, hình chụp không chứa đủ 4 góc biển hiệu</w:t>
-      </w:r>
-      <w:r>
-        <w:rPr>
-          <w:rFonts w:ascii="Times New Roman" w:hAnsi="Times New Roman" w:cs="Times New Roman"/>
-          <w:sz w:val="26"/>
-          <w:szCs w:val="26"/>
-        </w:rPr>
-        <w:t xml:space="preserve"> hoặc</w:t>
-      </w:r>
-      <w:r>
-        <w:rPr>
-          <w:rFonts w:ascii="Times New Roman" w:hAnsi="Times New Roman" w:cs="Times New Roman"/>
-          <w:sz w:val="26"/>
-          <w:szCs w:val="26"/>
-        </w:rPr>
-        <w:t xml:space="preserve"> nhòe,</w:t>
-      </w:r>
-      <w:r>
-        <w:rPr>
-          <w:rFonts w:ascii="Times New Roman" w:hAnsi="Times New Roman" w:cs="Times New Roman"/>
-          <w:sz w:val="26"/>
-          <w:szCs w:val="26"/>
-        </w:rPr>
-        <w:t xml:space="preserve"> mờ), hệ thống sử dụng chính các dòng văn bản bên trong</w:t>
+        <w:t>Thay vì dựa vào các cạnh vật lý của tấm biển (thường bị che khuất bởi các biển hiệu khác, hình chụp không chứa đủ 4 góc biển hiệu hoặc nhòe, mờ), hệ thống sử dụng chính các dòng văn bản bên trong</w:t>
       </w:r>
       <w:r>
         <w:rPr>
@@ -10036,23 +10268,7 @@
           <w:sz w:val="26"/>
           <w:szCs w:val="26"/>
         </w:rPr>
-        <w:t xml:space="preserve"> để nội suy ra góc nghiêng của mặt phẳng. Cụ thể, hệ thống lấy mẫu tọa độ các đỉnh của các cụm chữ và áp dụng hồi quy tuyến tính để tìm phương trình đường thẳng</w:t>
-      </w:r>
-      <w:r>
-        <w:rPr>
-          <w:rFonts w:ascii="Times New Roman" w:hAnsi="Times New Roman" w:cs="Times New Roman"/>
-          <w:sz w:val="26"/>
-          <w:szCs w:val="26"/>
-        </w:rPr>
-        <w:t xml:space="preserve"> </w:t>
-      </w:r>
-      <w:r>
-        <w:rPr>
-          <w:rFonts w:ascii="Times New Roman" w:hAnsi="Times New Roman" w:cs="Times New Roman"/>
-          <w:sz w:val="26"/>
-          <w:szCs w:val="26"/>
-        </w:rPr>
-        <w:t xml:space="preserve"> </w:t>
+        <w:t xml:space="preserve"> để nội suy ra góc nghiêng của mặt phẳng. Cụ thể, hệ thống lấy mẫu tọa độ các đỉnh của các cụm chữ và áp dụng hồi quy tuyến tính để tìm phương trình đường thẳng  </w:t>
       </w:r>
       <m:oMath>
         <m:r>
@@ -10108,15 +10324,7 @@
           <w:sz w:val="26"/>
           <w:szCs w:val="26"/>
         </w:rPr>
-        <w:t xml:space="preserve">  </w:t>
-      </w:r>
-      <w:r>
-        <w:rPr>
-          <w:rFonts w:ascii="Times New Roman" w:hAnsi="Times New Roman" w:cs="Times New Roman"/>
-          <w:sz w:val="26"/>
-          <w:szCs w:val="26"/>
-        </w:rPr>
-        <w:t>của các mép trên và mép dưới.</w:t>
+        <w:t xml:space="preserve">  của các mép trên và mép dưới.</w:t>
       </w:r>
     </w:p>
     <w:p>
@@ -10855,15 +11063,7 @@
                   <w:sz w:val="26"/>
                   <w:szCs w:val="26"/>
                 </w:rPr>
-                <m:t>b</m:t>
-              </m:r>
-              <m:r>
-                <w:rPr>
-                  <w:rFonts w:ascii="Cambria Math" w:hAnsi="Cambria Math"/>
-                  <w:sz w:val="26"/>
-                  <w:szCs w:val="26"/>
-                </w:rPr>
-                <m:t>1</m:t>
+                <m:t>b1</m:t>
               </m:r>
             </m:sub>
           </m:sSub>
@@ -10903,15 +11103,7 @@
                   <w:sz w:val="26"/>
                   <w:szCs w:val="26"/>
                 </w:rPr>
-                <m:t>b</m:t>
-              </m:r>
-              <m:r>
-                <w:rPr>
-                  <w:rFonts w:ascii="Cambria Math" w:hAnsi="Cambria Math"/>
-                  <w:sz w:val="26"/>
-                  <w:szCs w:val="26"/>
-                </w:rPr>
-                <m:t>2</m:t>
+                <m:t>b2</m:t>
               </m:r>
             </m:sub>
           </m:sSub>
@@ -10951,15 +11143,7 @@
                   <w:sz w:val="26"/>
                   <w:szCs w:val="26"/>
                 </w:rPr>
-                <m:t>b</m:t>
-              </m:r>
-              <m:r>
-                <w:rPr>
-                  <w:rFonts w:ascii="Cambria Math" w:hAnsi="Cambria Math"/>
-                  <w:sz w:val="26"/>
-                  <w:szCs w:val="26"/>
-                </w:rPr>
-                <m:t>n</m:t>
+                <m:t>bn</m:t>
               </m:r>
             </m:sub>
           </m:sSub>
@@ -11100,16 +11284,7 @@
           <w:sz w:val="26"/>
           <w:szCs w:val="26"/>
         </w:rPr>
-        <w:t>left</w:t>
-      </w:r>
-      <w:r>
-        <w:rPr>
-          <w:rFonts w:ascii="Cambria Math" w:hAnsi="Cambria Math"/>
-          <w:i/>
-          <w:sz w:val="26"/>
-          <w:szCs w:val="26"/>
-        </w:rPr>
-        <w:t xml:space="preserve">) </w:t>
+        <w:t xml:space="preserve">left) </w:t>
       </w:r>
       <w:r>
         <w:rPr>
@@ -11690,15 +11865,7 @@
                             <w:sz w:val="26"/>
                             <w:szCs w:val="26"/>
                           </w:rPr>
-                          <m:t>2</m:t>
-                        </m:r>
-                        <m:r>
-                          <w:rPr>
-                            <w:rFonts w:ascii="Cambria Math" w:hAnsi="Cambria Math"/>
-                            <w:sz w:val="26"/>
-                            <w:szCs w:val="26"/>
-                          </w:rPr>
-                          <m:t>1</m:t>
+                          <m:t>21</m:t>
                         </m:r>
                       </m:sub>
                     </m:sSub>
@@ -12101,15 +12268,7 @@
                       <w:sz w:val="26"/>
                       <w:szCs w:val="26"/>
                     </w:rPr>
-                    <m:t>+</m:t>
-                  </m:r>
-                  <m:r>
-                    <w:rPr>
-                      <w:rFonts w:ascii="Cambria Math" w:hAnsi="Cambria Math"/>
-                      <w:sz w:val="26"/>
-                      <w:szCs w:val="26"/>
-                    </w:rPr>
-                    <m:t>h</m:t>
+                    <m:t>+h</m:t>
                   </m:r>
                 </m:e>
                 <m:sub>
@@ -12193,15 +12352,7 @@
                       <w:sz w:val="26"/>
                       <w:szCs w:val="26"/>
                     </w:rPr>
-                    <m:t>3</m:t>
-                  </m:r>
-                  <m:r>
-                    <w:rPr>
-                      <w:rFonts w:ascii="Cambria Math" w:hAnsi="Cambria Math"/>
-                      <w:sz w:val="26"/>
-                      <w:szCs w:val="26"/>
-                    </w:rPr>
-                    <m:t>1</m:t>
+                    <m:t>31</m:t>
                   </m:r>
                 </m:sub>
               </m:sSub>
@@ -12391,15 +12542,7 @@
                       <w:sz w:val="26"/>
                       <w:szCs w:val="26"/>
                     </w:rPr>
-                    <m:t>2</m:t>
-                  </m:r>
-                  <m:r>
-                    <w:rPr>
-                      <w:rFonts w:ascii="Cambria Math" w:hAnsi="Cambria Math"/>
-                      <w:sz w:val="26"/>
-                      <w:szCs w:val="26"/>
-                    </w:rPr>
-                    <m:t>1</m:t>
+                    <m:t>21</m:t>
                   </m:r>
                 </m:sub>
               </m:sSub>
@@ -12439,15 +12582,7 @@
                       <w:sz w:val="26"/>
                       <w:szCs w:val="26"/>
                     </w:rPr>
-                    <m:t>2</m:t>
-                  </m:r>
-                  <m:r>
-                    <w:rPr>
-                      <w:rFonts w:ascii="Cambria Math" w:hAnsi="Cambria Math"/>
-                      <w:sz w:val="26"/>
-                      <w:szCs w:val="26"/>
-                    </w:rPr>
-                    <m:t>2</m:t>
+                    <m:t>22</m:t>
                   </m:r>
                 </m:sub>
               </m:sSub>
@@ -12487,15 +12622,7 @@
                       <w:sz w:val="26"/>
                       <w:szCs w:val="26"/>
                     </w:rPr>
-                    <m:t>2</m:t>
-                  </m:r>
-                  <m:r>
-                    <w:rPr>
-                      <w:rFonts w:ascii="Cambria Math" w:hAnsi="Cambria Math"/>
-                      <w:sz w:val="26"/>
-                      <w:szCs w:val="26"/>
-                    </w:rPr>
-                    <m:t>3</m:t>
+                    <m:t>23</m:t>
                   </m:r>
                 </m:sub>
               </m:sSub>
@@ -13687,14 +13814,7 @@
               <w:rFonts w:ascii="Cambria Math" w:hAnsi="Cambria Math"/>
               <w:lang w:val="en-US"/>
             </w:rPr>
-            <m:t>L =</m:t>
-          </m:r>
-          <m:r>
-            <w:rPr>
-              <w:rFonts w:ascii="Cambria Math" w:hAnsi="Cambria Math"/>
-              <w:lang w:val="en-US"/>
-            </w:rPr>
-            <m:t xml:space="preserve"> </m:t>
+            <m:t xml:space="preserve">L = </m:t>
           </m:r>
           <m:sSub>
             <m:sSubPr>
@@ -13729,14 +13849,7 @@
               <w:rFonts w:ascii="Cambria Math" w:hAnsi="Cambria Math"/>
               <w:lang w:val="en-US"/>
             </w:rPr>
-            <m:t xml:space="preserve"> +</m:t>
-          </m:r>
-          <m:r>
-            <w:rPr>
-              <w:rFonts w:ascii="Cambria Math" w:hAnsi="Cambria Math"/>
-              <w:lang w:val="en-US"/>
-            </w:rPr>
-            <m:t>α</m:t>
+            <m:t xml:space="preserve"> +α</m:t>
           </m:r>
           <m:sSub>
             <m:sSubPr>
@@ -13771,14 +13884,7 @@
               <w:rFonts w:ascii="Cambria Math" w:hAnsi="Cambria Math"/>
               <w:lang w:val="en-US"/>
             </w:rPr>
-            <m:t xml:space="preserve"> +</m:t>
-          </m:r>
-          <m:r>
-            <w:rPr>
-              <w:rFonts w:ascii="Cambria Math" w:hAnsi="Cambria Math"/>
-              <w:lang w:val="en-US"/>
-            </w:rPr>
-            <m:t>β</m:t>
+            <m:t xml:space="preserve"> +β</m:t>
           </m:r>
           <m:sSub>
             <m:sSubPr>
@@ -13958,23 +14064,7 @@
           <w:sz w:val="26"/>
           <w:szCs w:val="26"/>
         </w:rPr>
-        <w:t xml:space="preserve"> là </w:t>
-      </w:r>
-      <w:r>
-        <w:rPr>
-          <w:iCs/>
-          <w:sz w:val="26"/>
-          <w:szCs w:val="26"/>
-        </w:rPr>
-        <w:t>hàm mất mát Binary Cross Entropy (BCE)</w:t>
-      </w:r>
-      <w:r>
-        <w:rPr>
-          <w:iCs/>
-          <w:sz w:val="26"/>
-          <w:szCs w:val="26"/>
-        </w:rPr>
-        <w:t xml:space="preserve"> áp dụng cho bản đồ nhị phân xấp xỉ   </w:t>
+        <w:t xml:space="preserve"> là hàm mất mát Binary Cross Entropy (BCE) áp dụng cho bản đồ nhị phân xấp xỉ   </w:t>
       </w:r>
       <m:oMath>
         <m:acc>
@@ -14191,23 +14281,7 @@
           <w:szCs w:val="26"/>
         </w:rPr>
         <w:tab/>
-        <w:t>α, β là hệ số cân bằng giữa các thành phần loss (</w:t>
-      </w:r>
-      <w:r>
-        <w:rPr>
-          <w:iCs/>
-          <w:sz w:val="26"/>
-          <w:szCs w:val="26"/>
-        </w:rPr>
-        <w:t>α, β</w:t>
-      </w:r>
-      <w:r>
-        <w:rPr>
-          <w:iCs/>
-          <w:sz w:val="26"/>
-          <w:szCs w:val="26"/>
-        </w:rPr>
-        <w:t xml:space="preserve"> &gt; 0)</w:t>
+        <w:t>α, β là hệ số cân bằng giữa các thành phần loss (α, β &gt; 0)</w:t>
       </w:r>
     </w:p>
     <w:p>
@@ -14268,18 +14342,7 @@
           <w:sz w:val="26"/>
           <w:szCs w:val="26"/>
         </w:rPr>
-        <w:t xml:space="preserve"> dạng văn bản VietOCR và bài toán đặc thù tiếng Việt</w:t>
-      </w:r>
-      <w:r>
-        <w:rPr>
-          <w:rFonts w:ascii="Times New Roman" w:hAnsi="Times New Roman" w:cs="Times New Roman"/>
-          <w:b/>
-          <w:bCs/>
-          <w:iCs/>
-          <w:sz w:val="26"/>
-          <w:szCs w:val="26"/>
-        </w:rPr>
-        <w:t xml:space="preserve"> </w:t>
+        <w:t xml:space="preserve"> dạng văn bản VietOCR và bài toán đặc thù tiếng Việt </w:t>
       </w:r>
     </w:p>
     <w:p>
@@ -14298,15 +14361,7 @@
           <w:sz w:val="26"/>
           <w:szCs w:val="26"/>
         </w:rPr>
-        <w:t>Trong khâu nhận dạng ký tự (Text Recognition), hệ thống áp dụng bộ công cụ VietOCR. Khác với tiếng Anh, tiếng Việt là một ngôn ngữ có tính thanh điệu, sử dụng bảng chữ cái Latinh kết hợp với một hệ thống dấu câu phức tạp (bao gồm dấu thanh: sắc, huyền, hỏi, ngã, nặng và dấu mũ/râu: â, ă, ê, ô, ơ, ư). Các mô hình OCR truyền thống như CRNN (Convolutional Recurrent Neural Network) kết hợp hàm mất mát CTC (Connectionist Temporal Classification) thường giả định các ký tự là độc lập có điều kiện, dẫn đến việc thiếu khả năng suy luận ngữ cảnh và tỷ lệ rớt dấu tiếng Việt rất cao.</w:t>
-      </w:r>
-      <w:r>
-        <w:rPr>
-          <w:iCs/>
-          <w:sz w:val="26"/>
-          <w:szCs w:val="26"/>
-        </w:rPr>
-        <w:t xml:space="preserve"> </w:t>
+        <w:t xml:space="preserve">Trong khâu nhận dạng ký tự (Text Recognition), hệ thống áp dụng bộ công cụ VietOCR. Khác với tiếng Anh, tiếng Việt là một ngôn ngữ có tính thanh điệu, sử dụng bảng chữ cái Latinh kết hợp với một hệ thống dấu câu phức tạp (bao gồm dấu thanh: sắc, huyền, hỏi, ngã, nặng và dấu mũ/râu: â, ă, ê, ô, ơ, ư). Các mô hình OCR truyền thống như CRNN (Convolutional Recurrent Neural Network) kết hợp hàm mất mát CTC (Connectionist Temporal Classification) thường giả định các ký tự là độc lập có điều kiện, dẫn đến việc thiếu khả năng suy luận ngữ cảnh và tỷ lệ rớt dấu tiếng Việt rất cao. </w:t>
       </w:r>
     </w:p>
     <w:p>
@@ -14325,15 +14380,7 @@
           <w:sz w:val="26"/>
           <w:szCs w:val="26"/>
         </w:rPr>
-        <w:t>Để giải quyết triệt để rào cản ngôn ngữ này, VietOCR được xây dựng dựa trên khung kiến trúc Bộ mã hóa - Bộ giải mã (Encoder - Decoder), tách biệt nhiệm vụ trích xuất đặc trưng hình ảnh và nhiệm vụ mô hình hóa ngôn ngữ. VietOCR hỗ trợ nhiều tổ hợp kiến trúc khác nhau, bao gồm:</w:t>
-      </w:r>
-      <w:r>
-        <w:rPr>
-          <w:iCs/>
-          <w:sz w:val="26"/>
-          <w:szCs w:val="26"/>
-        </w:rPr>
-        <w:t xml:space="preserve"> </w:t>
+        <w:t xml:space="preserve">Để giải quyết triệt để rào cản ngôn ngữ này, VietOCR được xây dựng dựa trên khung kiến trúc Bộ mã hóa - Bộ giải mã (Encoder - Decoder), tách biệt nhiệm vụ trích xuất đặc trưng hình ảnh và nhiệm vụ mô hình hóa ngôn ngữ. VietOCR hỗ trợ nhiều tổ hợp kiến trúc khác nhau, bao gồm: </w:t>
       </w:r>
     </w:p>
     <w:p>
@@ -14409,15 +14456,7 @@
           <w:sz w:val="26"/>
           <w:szCs w:val="26"/>
         </w:rPr>
-        <w:t>Trong hệ thống của đề tài này, cấu hình mạng lai vgg_transformer được lựa chọn làm kiến trúc cốt lõi. Kiến trúc này hoạt động qua các giai đoạn tính toán toán học như sau:</w:t>
-      </w:r>
-      <w:r>
-        <w:rPr>
-          <w:iCs/>
-          <w:sz w:val="26"/>
-          <w:szCs w:val="26"/>
-        </w:rPr>
-        <w:t xml:space="preserve"> </w:t>
+        <w:t xml:space="preserve">Trong hệ thống của đề tài này, cấu hình mạng lai vgg_transformer được lựa chọn làm kiến trúc cốt lõi. Kiến trúc này hoạt động qua các giai đoạn tính toán toán học như sau: </w:t>
       </w:r>
     </w:p>
     <w:p>
@@ -14559,15 +14598,7 @@
             <w:sz w:val="26"/>
             <w:szCs w:val="26"/>
           </w:rPr>
-          <m:t>F</m:t>
-        </m:r>
-        <m:r>
-          <w:rPr>
-            <w:rFonts w:ascii="Cambria Math" w:hAnsi="Cambria Math"/>
-            <w:sz w:val="26"/>
-            <w:szCs w:val="26"/>
-          </w:rPr>
-          <m:t xml:space="preserve">∈ </m:t>
+          <m:t xml:space="preserve">F∈ </m:t>
         </m:r>
         <m:sSup>
           <m:sSupPr>
@@ -14811,15 +14842,7 @@
           <w:sz w:val="26"/>
           <w:szCs w:val="26"/>
         </w:rPr>
-        <w:t>:</w:t>
-      </w:r>
-      <w:r>
-        <w:rPr>
-          <w:iCs/>
-          <w:sz w:val="26"/>
-          <w:szCs w:val="26"/>
-        </w:rPr>
-        <w:t xml:space="preserve"> </w:t>
+        <w:t xml:space="preserve">: </w:t>
       </w:r>
     </w:p>
     <w:p>
@@ -15389,23 +15412,7 @@
                   <w:sz w:val="26"/>
                   <w:szCs w:val="26"/>
                 </w:rPr>
-                <m:t>(pos, 2i</m:t>
-              </m:r>
-              <m:r>
-                <w:rPr>
-                  <w:rFonts w:ascii="Cambria Math" w:hAnsi="Cambria Math"/>
-                  <w:sz w:val="26"/>
-                  <w:szCs w:val="26"/>
-                </w:rPr>
-                <m:t>+1</m:t>
-              </m:r>
-              <m:r>
-                <w:rPr>
-                  <w:rFonts w:ascii="Cambria Math" w:hAnsi="Cambria Math"/>
-                  <w:sz w:val="26"/>
-                  <w:szCs w:val="26"/>
-                </w:rPr>
-                <m:t>)</m:t>
+                <m:t>(pos, 2i+1)</m:t>
               </m:r>
             </m:sub>
           </m:sSub>
@@ -15601,17 +15608,7 @@
           <w:sz w:val="26"/>
           <w:szCs w:val="26"/>
         </w:rPr>
-        <w:t>Giai đoạn 3: Giải mã chuỗi ký tự (Transformer Decoder)</w:t>
-      </w:r>
-      <w:r>
-        <w:rPr>
-          <w:b/>
-          <w:bCs/>
-          <w:iCs/>
-          <w:sz w:val="26"/>
-          <w:szCs w:val="26"/>
-        </w:rPr>
-        <w:t xml:space="preserve">: </w:t>
+        <w:t xml:space="preserve">Giai đoạn 3: Giải mã chuỗi ký tự (Transformer Decoder): </w:t>
       </w:r>
       <w:r>
         <w:rPr>
@@ -16643,13 +16640,6 @@
           <w:szCs w:val="26"/>
         </w:rPr>
         <w:tab/>
-      </w:r>
-      <w:r>
-        <w:rPr>
-          <w:iCs/>
-          <w:sz w:val="26"/>
-          <w:szCs w:val="26"/>
-        </w:rPr>
         <w:t xml:space="preserve">Giả sử vector truy vấn </w:t>
       </w:r>
       <w:r>
@@ -17938,23 +17928,7 @@
             <w:sz w:val="26"/>
             <w:szCs w:val="26"/>
           </w:rPr>
-          <m:t>=</m:t>
-        </m:r>
-        <m:r>
-          <w:rPr>
-            <w:rFonts w:ascii="Cambria Math" w:hAnsi="Cambria Math"/>
-            <w:sz w:val="26"/>
-            <w:szCs w:val="26"/>
-          </w:rPr>
-          <m:t xml:space="preserve"> z.</m:t>
-        </m:r>
-        <m:r>
-          <w:rPr>
-            <w:rFonts w:ascii="Cambria Math" w:hAnsi="Cambria Math"/>
-            <w:sz w:val="26"/>
-            <w:szCs w:val="26"/>
-          </w:rPr>
-          <m:t>σ</m:t>
+          <m:t>= z.σ</m:t>
         </m:r>
         <m:d>
           <m:dPr>
@@ -19311,23 +19285,7 @@
                       <w:sz w:val="26"/>
                       <w:szCs w:val="26"/>
                     </w:rPr>
-                    <m:t>x</m:t>
-                  </m:r>
-                  <m:r>
-                    <w:rPr>
-                      <w:rFonts w:ascii="Cambria Math" w:hAnsi="Cambria Math"/>
-                      <w:sz w:val="26"/>
-                      <w:szCs w:val="26"/>
-                    </w:rPr>
-                    <m:t>×</m:t>
-                  </m:r>
-                  <m:r>
-                    <w:rPr>
-                      <w:rFonts w:ascii="Cambria Math" w:hAnsi="Cambria Math"/>
-                      <w:sz w:val="26"/>
-                      <w:szCs w:val="26"/>
-                    </w:rPr>
-                    <m:t>y</m:t>
+                    <m:t>x×y</m:t>
                   </m:r>
                 </m:num>
                 <m:den>
@@ -19377,15 +19335,7 @@
                           <w:sz w:val="26"/>
                           <w:szCs w:val="26"/>
                         </w:rPr>
-                        <m:t>×</m:t>
-                      </m:r>
-                      <m:r>
-                        <w:rPr>
-                          <w:rFonts w:ascii="Cambria Math" w:hAnsi="Cambria Math"/>
-                          <w:sz w:val="26"/>
-                          <w:szCs w:val="26"/>
-                        </w:rPr>
-                        <m:t xml:space="preserve"> </m:t>
+                        <m:t xml:space="preserve">× </m:t>
                       </m:r>
                     </m:e>
                   </m:d>
@@ -21080,18 +21030,7 @@
           <w:sz w:val="26"/>
           <w:szCs w:val="26"/>
         </w:rPr>
-        <w:t xml:space="preserve">Thuật toán </w:t>
-      </w:r>
-      <w:r>
-        <w:rPr>
-          <w:rFonts w:ascii="Times New Roman" w:hAnsi="Times New Roman" w:cs="Times New Roman"/>
-          <w:b/>
-          <w:bCs/>
-          <w:iCs/>
-          <w:sz w:val="26"/>
-          <w:szCs w:val="26"/>
-        </w:rPr>
-        <w:t>Naive Bayes</w:t>
+        <w:t>Thuật toán Naive Bayes</w:t>
       </w:r>
     </w:p>
     <w:p>
@@ -21322,15 +21261,7 @@
           <w:sz w:val="26"/>
           <w:szCs w:val="26"/>
         </w:rPr>
-        <w:t xml:space="preserve"> </w:t>
-      </w:r>
-      <w:r>
-        <w:rPr>
-          <w:iCs/>
-          <w:sz w:val="26"/>
-          <w:szCs w:val="26"/>
-        </w:rPr>
-        <w:t xml:space="preserve">, ...} có xác suất cao nhất dựa trên văn bản đầu vào </w:t>
+        <w:t xml:space="preserve"> , ...} có xác suất cao nhất dựa trên văn bản đầu vào </w:t>
       </w:r>
       <w:r>
         <w:rPr>
@@ -21833,25 +21764,7 @@
             <w:szCs w:val="26"/>
             <w:lang w:val="en-US"/>
           </w:rPr>
-          <m:t xml:space="preserve">P(X | </m:t>
-        </m:r>
-        <m:r>
-          <w:rPr>
-            <w:rFonts w:ascii="Cambria Math" w:hAnsi="Cambria Math"/>
-            <w:sz w:val="26"/>
-            <w:szCs w:val="26"/>
-            <w:lang w:val="en-US"/>
-          </w:rPr>
-          <m:t>s</m:t>
-        </m:r>
-        <m:r>
-          <w:rPr>
-            <w:rFonts w:ascii="Cambria Math" w:hAnsi="Cambria Math"/>
-            <w:sz w:val="26"/>
-            <w:szCs w:val="26"/>
-            <w:lang w:val="en-US"/>
-          </w:rPr>
-          <m:t>)</m:t>
+          <m:t>P(X | s)</m:t>
         </m:r>
       </m:oMath>
       <w:r>
@@ -22187,23 +22100,7 @@
             <w:sz w:val="26"/>
             <w:szCs w:val="26"/>
           </w:rPr>
-          <m:t xml:space="preserve">P(X | </m:t>
-        </m:r>
-        <m:r>
-          <w:rPr>
-            <w:rFonts w:ascii="Cambria Math" w:hAnsi="Cambria Math"/>
-            <w:sz w:val="26"/>
-            <w:szCs w:val="26"/>
-          </w:rPr>
-          <m:t>s</m:t>
-        </m:r>
-        <m:r>
-          <w:rPr>
-            <w:rFonts w:ascii="Cambria Math" w:hAnsi="Cambria Math"/>
-            <w:sz w:val="26"/>
-            <w:szCs w:val="26"/>
-          </w:rPr>
-          <m:t>)</m:t>
+          <m:t>P(X | s)</m:t>
         </m:r>
       </m:oMath>
       <w:r>
@@ -23904,15 +23801,7 @@
           <w:sz w:val="26"/>
           <w:szCs w:val="26"/>
         </w:rPr>
-        <w:t xml:space="preserve"> </w:t>
-      </w:r>
-      <w:r>
-        <w:rPr>
-          <w:rFonts w:ascii="Times New Roman" w:hAnsi="Times New Roman" w:cs="Times New Roman"/>
-          <w:sz w:val="26"/>
-          <w:szCs w:val="26"/>
-        </w:rPr>
-        <w:t>Spatial Preprocessing</w:t>
+        <w:t xml:space="preserve"> Spatial Preprocessing</w:t>
       </w:r>
       <w:r>
         <w:rPr>
@@ -24181,14 +24070,7 @@
           <w:rFonts w:ascii="Times New Roman" w:hAnsi="Times New Roman" w:cs="Times New Roman"/>
           <w:szCs w:val="26"/>
         </w:rPr>
-        <w:t xml:space="preserve">2.1.2 </w:t>
-      </w:r>
-      <w:r>
-        <w:rPr>
-          <w:rFonts w:ascii="Times New Roman" w:hAnsi="Times New Roman" w:cs="Times New Roman"/>
-          <w:szCs w:val="26"/>
-        </w:rPr>
-        <w:t>Phân tích chi tiết các giai đoạn xử lý của hệ thống</w:t>
+        <w:t>2.1.2 Phân tích chi tiết các giai đoạn xử lý của hệ thống</w:t>
       </w:r>
     </w:p>
     <w:p>
@@ -24274,33 +24156,15 @@
           <w:sz w:val="26"/>
           <w:szCs w:val="26"/>
         </w:rPr>
-        <w:t>Bước 1: Trích xuất siêu dữ liệu (Metadata/EXIF)</w:t>
-      </w:r>
-      <w:r>
-        <w:rPr>
-          <w:rFonts w:ascii="Times New Roman" w:hAnsi="Times New Roman" w:cs="Times New Roman"/>
-          <w:b/>
-          <w:bCs/>
-          <w:sz w:val="26"/>
-          <w:szCs w:val="26"/>
-        </w:rPr>
-        <w:t>:</w:t>
-      </w:r>
-      <w:r>
-        <w:rPr>
-          <w:rFonts w:ascii="Times New Roman" w:hAnsi="Times New Roman" w:cs="Times New Roman"/>
-          <w:sz w:val="26"/>
-          <w:szCs w:val="26"/>
-        </w:rPr>
-        <w:t xml:space="preserve"> </w:t>
-      </w:r>
-      <w:r>
-        <w:rPr>
-          <w:rFonts w:ascii="Times New Roman" w:hAnsi="Times New Roman" w:cs="Times New Roman"/>
-          <w:sz w:val="26"/>
-          <w:szCs w:val="26"/>
-        </w:rPr>
-        <w:t xml:space="preserve">Khi bức ảnh được tải lên bộ nhớ, hệ thống không chỉ đọc ma trận điểm ảnh (pixel </w:t>
+        <w:t>Bước 1: Trích xuất siêu dữ liệu (Metadata/EXIF):</w:t>
+      </w:r>
+      <w:r>
+        <w:rPr>
+          <w:rFonts w:ascii="Times New Roman" w:hAnsi="Times New Roman" w:cs="Times New Roman"/>
+          <w:sz w:val="26"/>
+          <w:szCs w:val="26"/>
+        </w:rPr>
+        <w:t xml:space="preserve"> Khi bức ảnh được tải lên bộ nhớ, hệ thống không chỉ đọc ma trận điểm ảnh (pixel </w:t>
       </w:r>
       <w:r>
         <w:rPr>
@@ -24399,17 +24263,7 @@
           <w:sz w:val="26"/>
           <w:szCs w:val="26"/>
         </w:rPr>
-        <w:t>)</w:t>
-      </w:r>
-      <w:r>
-        <w:rPr>
-          <w:rFonts w:ascii="Times New Roman" w:hAnsi="Times New Roman" w:cs="Times New Roman"/>
-          <w:b/>
-          <w:bCs/>
-          <w:sz w:val="26"/>
-          <w:szCs w:val="26"/>
-        </w:rPr>
-        <w:t>:</w:t>
+        <w:t>):</w:t>
       </w:r>
       <w:r>
         <w:rPr>
@@ -24491,63 +24345,7 @@
           <w:sz w:val="26"/>
           <w:szCs w:val="26"/>
         </w:rPr>
-        <w:t xml:space="preserve">Tensor này được đẩy vào mạng xương sống CSPDarknet của YOLOv8. Tại đây, các phép nhân tích chập (Convolutional kernels) trượt qua để tạo ra các </w:t>
-      </w:r>
-      <w:r>
-        <w:rPr>
-          <w:rFonts w:ascii="Times New Roman" w:hAnsi="Times New Roman" w:cs="Times New Roman"/>
-          <w:sz w:val="26"/>
-          <w:szCs w:val="26"/>
-        </w:rPr>
-        <w:t>b</w:t>
-      </w:r>
-      <w:r>
-        <w:rPr>
-          <w:rFonts w:ascii="Times New Roman" w:hAnsi="Times New Roman" w:cs="Times New Roman"/>
-          <w:sz w:val="26"/>
-          <w:szCs w:val="26"/>
-        </w:rPr>
-        <w:t xml:space="preserve">ản đồ đặc trưng (Feature Maps), cho phép </w:t>
-      </w:r>
-      <w:r>
-        <w:rPr>
-          <w:rFonts w:ascii="Times New Roman" w:hAnsi="Times New Roman" w:cs="Times New Roman"/>
-          <w:sz w:val="26"/>
-          <w:szCs w:val="26"/>
-        </w:rPr>
-        <w:t>đ</w:t>
-      </w:r>
-      <w:r>
-        <w:rPr>
-          <w:rFonts w:ascii="Times New Roman" w:hAnsi="Times New Roman" w:cs="Times New Roman"/>
-          <w:sz w:val="26"/>
-          <w:szCs w:val="26"/>
-        </w:rPr>
-        <w:t xml:space="preserve">ầu ra phân tách (Decoupled Head) dự đoán </w:t>
-      </w:r>
-      <w:r>
-        <w:rPr>
-          <w:rFonts w:ascii="Times New Roman" w:hAnsi="Times New Roman" w:cs="Times New Roman"/>
-          <w:sz w:val="26"/>
-          <w:szCs w:val="26"/>
-        </w:rPr>
-        <w:t>nhiều</w:t>
-      </w:r>
-      <w:r>
-        <w:rPr>
-          <w:rFonts w:ascii="Times New Roman" w:hAnsi="Times New Roman" w:cs="Times New Roman"/>
-          <w:sz w:val="26"/>
-          <w:szCs w:val="26"/>
-        </w:rPr>
-        <w:t xml:space="preserve"> hộp bao giả định chứa biển hiệu.</w:t>
-      </w:r>
-      <w:r>
-        <w:rPr>
-          <w:rFonts w:ascii="Times New Roman" w:hAnsi="Times New Roman" w:cs="Times New Roman"/>
-          <w:sz w:val="26"/>
-          <w:szCs w:val="26"/>
-        </w:rPr>
-        <w:t xml:space="preserve"> </w:t>
+        <w:t xml:space="preserve">Tensor này được đẩy vào mạng xương sống CSPDarknet của YOLOv8. Tại đây, các phép nhân tích chập (Convolutional kernels) trượt qua để tạo ra các bản đồ đặc trưng (Feature Maps), cho phép đầu ra phân tách (Decoupled Head) dự đoán nhiều hộp bao giả định chứa biển hiệu. </w:t>
       </w:r>
     </w:p>
     <w:p>
@@ -25485,17 +25283,7 @@
           <w:sz w:val="26"/>
           <w:szCs w:val="26"/>
         </w:rPr>
-        <w:t>T</w:t>
-      </w:r>
-      <w:r>
-        <w:rPr>
-          <w:rFonts w:ascii="Times New Roman" w:hAnsi="Times New Roman" w:cs="Times New Roman"/>
-          <w:b/>
-          <w:bCs/>
-          <w:sz w:val="26"/>
-          <w:szCs w:val="26"/>
-        </w:rPr>
-        <w:t xml:space="preserve">ính toán véc-tơ chỉ phương và </w:t>
+        <w:t xml:space="preserve">Tính toán véc-tơ chỉ phương và </w:t>
       </w:r>
       <w:r>
         <w:rPr>
@@ -25547,23 +25335,7 @@
           <w:sz w:val="26"/>
           <w:szCs w:val="26"/>
         </w:rPr>
-        <w:t>Giả định toán học được đặt ra là: Hầu hết các dòng chữ trên biển hiệu đều được in song song với mép trên/dưới của tấm biển.</w:t>
-      </w:r>
-      <w:r>
-        <w:rPr>
-          <w:rFonts w:ascii="Times New Roman" w:hAnsi="Times New Roman" w:cs="Times New Roman"/>
-          <w:sz w:val="26"/>
-          <w:szCs w:val="26"/>
-        </w:rPr>
-        <w:t xml:space="preserve"> </w:t>
-      </w:r>
-      <w:r>
-        <w:rPr>
-          <w:rFonts w:ascii="Times New Roman" w:hAnsi="Times New Roman" w:cs="Times New Roman"/>
-          <w:sz w:val="26"/>
-          <w:szCs w:val="26"/>
-        </w:rPr>
-        <w:t xml:space="preserve">Hệ thống duyệt qua mảng </w:t>
+        <w:t xml:space="preserve">Giả định toán học được đặt ra là: Hầu hết các dòng chữ trên biển hiệu đều được in song song với mép trên/dưới của tấm biển. Hệ thống duyệt qua mảng </w:t>
       </w:r>
       <m:oMath>
         <m:r>
@@ -25820,31 +25592,7 @@
             <w:sz w:val="26"/>
             <w:szCs w:val="26"/>
           </w:rPr>
-          <m:t>$</m:t>
-        </m:r>
-        <m:r>
-          <w:rPr>
-            <w:rFonts w:ascii="Cambria Math" w:hAnsi="Cambria Math" w:cs="Times New Roman"/>
-            <w:sz w:val="26"/>
-            <w:szCs w:val="26"/>
-          </w:rPr>
-          <m:t>θ</m:t>
-        </m:r>
-        <m:r>
-          <w:rPr>
-            <w:rFonts w:ascii="Cambria Math" w:hAnsi="Cambria Math" w:cs="Times New Roman"/>
-            <w:sz w:val="26"/>
-            <w:szCs w:val="26"/>
-          </w:rPr>
-          <m:t xml:space="preserve"> =</m:t>
-        </m:r>
-        <m:r>
-          <w:rPr>
-            <w:rFonts w:ascii="Cambria Math" w:hAnsi="Cambria Math" w:cs="Times New Roman"/>
-            <w:sz w:val="26"/>
-            <w:szCs w:val="26"/>
-          </w:rPr>
-          <m:t xml:space="preserve"> </m:t>
+          <m:t xml:space="preserve">$θ = </m:t>
         </m:r>
         <m:func>
           <m:funcPr>
@@ -26112,15 +25860,7 @@
             <w:sz w:val="26"/>
             <w:szCs w:val="26"/>
           </w:rPr>
-          <m:t>θ</m:t>
-        </m:r>
-        <m:r>
-          <w:rPr>
-            <w:rFonts w:ascii="Cambria Math" w:hAnsi="Cambria Math" w:cs="Times New Roman"/>
-            <w:sz w:val="26"/>
-            <w:szCs w:val="26"/>
-          </w:rPr>
-          <m:t xml:space="preserve"> </m:t>
+          <m:t xml:space="preserve">θ </m:t>
         </m:r>
       </m:oMath>
       <w:r>
@@ -26362,47 +26102,7 @@
           <w:sz w:val="26"/>
           <w:szCs w:val="26"/>
         </w:rPr>
-        <w:t xml:space="preserve">Ngoại suy tập điểm </w:t>
-      </w:r>
-      <w:r>
-        <w:rPr>
-          <w:rFonts w:ascii="Times New Roman" w:hAnsi="Times New Roman" w:cs="Times New Roman"/>
-          <w:b/>
-          <w:bCs/>
-          <w:sz w:val="26"/>
-          <w:szCs w:val="26"/>
-        </w:rPr>
-        <w:t>n</w:t>
-      </w:r>
-      <w:r>
-        <w:rPr>
-          <w:rFonts w:ascii="Times New Roman" w:hAnsi="Times New Roman" w:cs="Times New Roman"/>
-          <w:b/>
-          <w:bCs/>
-          <w:sz w:val="26"/>
-          <w:szCs w:val="26"/>
-        </w:rPr>
-        <w:t xml:space="preserve">guồn - </w:t>
-      </w:r>
-      <w:r>
-        <w:rPr>
-          <w:rFonts w:ascii="Times New Roman" w:hAnsi="Times New Roman" w:cs="Times New Roman"/>
-          <w:b/>
-          <w:bCs/>
-          <w:sz w:val="26"/>
-          <w:szCs w:val="26"/>
-        </w:rPr>
-        <w:t>đ</w:t>
-      </w:r>
-      <w:r>
-        <w:rPr>
-          <w:rFonts w:ascii="Times New Roman" w:hAnsi="Times New Roman" w:cs="Times New Roman"/>
-          <w:b/>
-          <w:bCs/>
-          <w:sz w:val="26"/>
-          <w:szCs w:val="26"/>
-        </w:rPr>
-        <w:t>ích (Source-Destination Mapping):</w:t>
+        <w:t>Ngoại suy tập điểm nguồn - đích (Source-Destination Mapping):</w:t>
       </w:r>
       <w:r>
         <w:rPr>
@@ -26434,15 +26134,7 @@
           <w:sz w:val="26"/>
           <w:szCs w:val="26"/>
         </w:rPr>
-        <w:t>Tập điểm Nguồn</w:t>
-      </w:r>
-      <w:r>
-        <w:rPr>
-          <w:rFonts w:ascii="Times New Roman" w:hAnsi="Times New Roman" w:cs="Times New Roman"/>
-          <w:sz w:val="26"/>
-          <w:szCs w:val="26"/>
-        </w:rPr>
-        <w:t xml:space="preserve"> </w:t>
+        <w:t xml:space="preserve">Tập điểm Nguồn </w:t>
       </w:r>
       <m:oMath>
         <m:r>
@@ -26535,15 +26227,7 @@
             <w:sz w:val="26"/>
             <w:szCs w:val="26"/>
           </w:rPr>
-          <m:t>S =</m:t>
-        </m:r>
-        <m:r>
-          <w:rPr>
-            <w:rFonts w:ascii="Cambria Math" w:hAnsi="Cambria Math" w:cs="Times New Roman"/>
-            <w:sz w:val="26"/>
-            <w:szCs w:val="26"/>
-          </w:rPr>
-          <m:t>{</m:t>
+          <m:t>S ={</m:t>
         </m:r>
         <m:sSub>
           <m:sSubPr>
@@ -27088,23 +26772,7 @@
             <w:sz w:val="26"/>
             <w:szCs w:val="26"/>
           </w:rPr>
-          <m:t>H</m:t>
-        </m:r>
-        <m:r>
-          <w:rPr>
-            <w:rFonts w:ascii="Cambria Math" w:hAnsi="Cambria Math" w:cs="Times New Roman"/>
-            <w:sz w:val="26"/>
-            <w:szCs w:val="26"/>
-          </w:rPr>
-          <m:t>∈</m:t>
-        </m:r>
-        <m:r>
-          <w:rPr>
-            <w:rFonts w:ascii="Cambria Math" w:hAnsi="Cambria Math" w:cs="Times New Roman"/>
-            <w:sz w:val="26"/>
-            <w:szCs w:val="26"/>
-          </w:rPr>
-          <m:t xml:space="preserve"> </m:t>
+          <m:t xml:space="preserve">H∈ </m:t>
         </m:r>
         <m:sSup>
           <m:sSupPr>
@@ -27462,23 +27130,7 @@
             <w:sz w:val="26"/>
             <w:szCs w:val="26"/>
           </w:rPr>
-          <m:t>&lt;</m:t>
-        </m:r>
-        <m:r>
-          <w:rPr>
-            <w:rFonts w:ascii="Cambria Math" w:hAnsi="Cambria Math" w:cs="Times New Roman"/>
-            <w:sz w:val="26"/>
-            <w:szCs w:val="26"/>
-          </w:rPr>
-          <m:t>4</m:t>
-        </m:r>
-        <m:r>
-          <w:rPr>
-            <w:rFonts w:ascii="Cambria Math" w:hAnsi="Cambria Math" w:cs="Times New Roman"/>
-            <w:sz w:val="26"/>
-            <w:szCs w:val="26"/>
-          </w:rPr>
-          <m:t>%</m:t>
+          <m:t>&lt;4%</m:t>
         </m:r>
       </m:oMath>
       <w:r>
@@ -29956,6 +29608,7 @@
       </w:pPr>
       <w:bookmarkStart w:id="41" w:name="_Toc225353121"/>
       <w:r>
+        <w:lastRenderedPageBreak/>
         <w:t>III. PHẦN KẾT LUẬN</w:t>
       </w:r>
       <w:bookmarkEnd w:id="41"/>
@@ -37060,6 +36713,7 @@
   <w:style w:type="character" w:default="1" w:styleId="DefaultParagraphFont">
     <w:name w:val="Default Paragraph Font"/>
     <w:uiPriority w:val="1"/>
+    <w:semiHidden/>
     <w:unhideWhenUsed/>
   </w:style>
   <w:style w:type="table" w:default="1" w:styleId="TableNormal">
@@ -38582,6 +38236,20 @@
 </file>
 
 <file path=customXml/item1.xml><?xml version="1.0" encoding="utf-8"?>
+<s:customData xmlns="http://www.wps.cn/officeDocument/2013/wpsCustomData" xmlns:s="http://www.wps.cn/officeDocument/2013/wpsCustomData">
+  <customSectProps>
+    <customSectPr/>
+    <customSectPr/>
+    <customSectPr/>
+    <customSectPr/>
+  </customSectProps>
+  <customShpExts>
+    <customShpInfo spid="_x0000_s1026" textRotate="1"/>
+  </customShpExts>
+</s:customData>
+</file>
+
+<file path=customXml/item2.xml><?xml version="1.0" encoding="utf-8"?>
 <b:Sources xmlns:b="http://schemas.openxmlformats.org/officeDocument/2006/bibliography" xmlns="http://schemas.openxmlformats.org/officeDocument/2006/bibliography" SelectedStyle="\IEEE2006OfficeOnline.xsl" StyleName="IEEE" Version="2006">
   <b:Source>
     <b:Tag>ZSh</b:Tag>
@@ -38745,20 +38413,6 @@
 </b:Sources>
 </file>
 
-<file path=customXml/item2.xml><?xml version="1.0" encoding="utf-8"?>
-<s:customData xmlns="http://www.wps.cn/officeDocument/2013/wpsCustomData" xmlns:s="http://www.wps.cn/officeDocument/2013/wpsCustomData">
-  <customSectProps>
-    <customSectPr/>
-    <customSectPr/>
-    <customSectPr/>
-    <customSectPr/>
-  </customSectProps>
-  <customShpExts>
-    <customShpInfo spid="_x0000_s1026" textRotate="1"/>
-  </customShpExts>
-</s:customData>
-</file>
-
 <file path=customXml/item3.xml><?xml version="1.0" encoding="utf-8"?>
 <go:gDocsCustomXmlDataStorage xmlns:go="http://customooxmlschemas.google.com/" xmlns:r="http://schemas.openxmlformats.org/officeDocument/2006/relationships" uri="GoogleDocsCustomDataVersion2">
   <go:docsCustomData xmlns:go="http://customooxmlschemas.google.com/" roundtripDataSignature="AMtx7mjf8YypuUpLbQR9JpUrCVless0TcQ==">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</go:docsCustomData>
@@ -38766,17 +38420,17 @@
 </file>
 
 <file path=customXml/itemProps1.xml><?xml version="1.0" encoding="utf-8"?>
-<ds:datastoreItem xmlns:ds="http://schemas.openxmlformats.org/officeDocument/2006/customXml" ds:itemID="{AF1B1CA4-45C1-42AF-AA33-F90B40A1DCF8}">
+<ds:datastoreItem xmlns:ds="http://schemas.openxmlformats.org/officeDocument/2006/customXml" ds:itemID="{B1977F7D-205B-4081-913C-38D41E755F92}">
   <ds:schemaRefs>
-    <ds:schemaRef ds:uri="http://schemas.openxmlformats.org/officeDocument/2006/bibliography"/>
+    <ds:schemaRef ds:uri="http://www.wps.cn/officeDocument/2013/wpsCustomData"/>
   </ds:schemaRefs>
 </ds:datastoreItem>
 </file>
 
 <file path=customXml/itemProps2.xml><?xml version="1.0" encoding="utf-8"?>
-<ds:datastoreItem xmlns:ds="http://schemas.openxmlformats.org/officeDocument/2006/customXml" ds:itemID="{B1977F7D-205B-4081-913C-38D41E755F92}">
+<ds:datastoreItem xmlns:ds="http://schemas.openxmlformats.org/officeDocument/2006/customXml" ds:itemID="{AF1B1CA4-45C1-42AF-AA33-F90B40A1DCF8}">
   <ds:schemaRefs>
-    <ds:schemaRef ds:uri="http://www.wps.cn/officeDocument/2013/wpsCustomData"/>
+    <ds:schemaRef ds:uri="http://schemas.openxmlformats.org/officeDocument/2006/bibliography"/>
   </ds:schemaRefs>
 </ds:datastoreItem>
 </file>

</xml_diff>